<commit_message>
Updated bre file Ass.1
</commit_message>
<xml_diff>
--- a/assignmengt1 summary and cv.docx
+++ b/assignmengt1 summary and cv.docx
@@ -4694,6 +4694,8 @@
           <w:szCs w:val="40"/>
         </w:rPr>
       </w:pPr>
+      <w:bookmarkStart w:id="0" w:name="_GoBack"/>
+      <w:bookmarkEnd w:id="0"/>
     </w:p>
     <w:p>
       <w:pPr>
@@ -4852,8 +4854,6 @@
         </w:rPr>
         <w:t>organised</w:t>
       </w:r>
-      <w:bookmarkStart w:id="0" w:name="_GoBack"/>
-      <w:bookmarkEnd w:id="0"/>
       <w:proofErr w:type="spellEnd"/>
       <w:r>
         <w:rPr>
@@ -7090,18 +7090,18 @@
         <w:noProof/>
       </w:rPr>
       <w:drawing>
-        <wp:anchor distT="0" distB="0" distL="114300" distR="114300" simplePos="0" relativeHeight="251659264" behindDoc="0" locked="0" layoutInCell="1" allowOverlap="1">
+        <wp:anchor distT="0" distB="0" distL="114300" distR="114300" simplePos="0" relativeHeight="251662336" behindDoc="0" locked="0" layoutInCell="1" allowOverlap="1">
           <wp:simplePos x="0" y="0"/>
           <wp:positionH relativeFrom="margin">
-            <wp:posOffset>4965700</wp:posOffset>
+            <wp:posOffset>4903942</wp:posOffset>
           </wp:positionH>
-          <wp:positionV relativeFrom="page">
-            <wp:posOffset>122446</wp:posOffset>
+          <wp:positionV relativeFrom="margin">
+            <wp:posOffset>-715645</wp:posOffset>
           </wp:positionV>
-          <wp:extent cx="1529080" cy="725170"/>
-          <wp:effectExtent l="0" t="0" r="0" b="0"/>
+          <wp:extent cx="1520190" cy="523875"/>
+          <wp:effectExtent l="0" t="0" r="3810" b="9525"/>
           <wp:wrapSquare wrapText="bothSides"/>
-          <wp:docPr id="33" name="Picture 33"/>
+          <wp:docPr id="34" name="Picture 34"/>
           <wp:cNvGraphicFramePr>
             <a:graphicFrameLocks xmlns:a="http://schemas.openxmlformats.org/drawingml/2006/main" noChangeAspect="1"/>
           </wp:cNvGraphicFramePr>
@@ -7109,7 +7109,7 @@
             <a:graphicData uri="http://schemas.openxmlformats.org/drawingml/2006/picture">
               <pic:pic xmlns:pic="http://schemas.openxmlformats.org/drawingml/2006/picture">
                 <pic:nvPicPr>
-                  <pic:cNvPr id="33" name="logo-vector-university-of-bedfordshire.webp"/>
+                  <pic:cNvPr id="34" name="Screenshot 2026-10-04 100301.png"/>
                   <pic:cNvPicPr/>
                 </pic:nvPicPr>
                 <pic:blipFill>
@@ -7127,7 +7127,7 @@
                 <pic:spPr>
                   <a:xfrm>
                     <a:off x="0" y="0"/>
-                    <a:ext cx="1529080" cy="725170"/>
+                    <a:ext cx="1520190" cy="523875"/>
                   </a:xfrm>
                   <a:prstGeom prst="rect">
                     <a:avLst/>
@@ -7150,7 +7150,7 @@
         <w:noProof/>
       </w:rPr>
       <w:drawing>
-        <wp:anchor distT="0" distB="0" distL="114300" distR="114300" simplePos="0" relativeHeight="251658240" behindDoc="0" locked="0" layoutInCell="1" allowOverlap="1">
+        <wp:anchor distT="0" distB="0" distL="114300" distR="114300" simplePos="0" relativeHeight="251658240" behindDoc="0" locked="0" layoutInCell="1" allowOverlap="1" wp14:anchorId="3D30B1B2" wp14:editId="101DDCA6">
           <wp:simplePos x="0" y="0"/>
           <wp:positionH relativeFrom="margin">
             <wp:posOffset>-409575</wp:posOffset>

</xml_diff>

<commit_message>
Breo file Ass.1 added
</commit_message>
<xml_diff>
--- a/assignmengt1 summary and cv.docx
+++ b/assignmengt1 summary and cv.docx
@@ -4694,8 +4694,6 @@
           <w:szCs w:val="40"/>
         </w:rPr>
       </w:pPr>
-      <w:bookmarkStart w:id="0" w:name="_GoBack"/>
-      <w:bookmarkEnd w:id="0"/>
     </w:p>
     <w:p>
       <w:pPr>
@@ -4726,6 +4724,8 @@
         </w:rPr>
         <w:t>te-Making and Mind Mapping.</w:t>
       </w:r>
+      <w:bookmarkStart w:id="0" w:name="_GoBack"/>
+      <w:bookmarkEnd w:id="0"/>
     </w:p>
     <w:p>
       <w:pPr>
@@ -7019,7 +7019,7 @@
             <w:bCs/>
             <w:noProof/>
           </w:rPr>
-          <w:t>2</w:t>
+          <w:t>4</w:t>
         </w:r>
         <w:r>
           <w:rPr>
@@ -7093,15 +7093,15 @@
         <wp:anchor distT="0" distB="0" distL="114300" distR="114300" simplePos="0" relativeHeight="251662336" behindDoc="0" locked="0" layoutInCell="1" allowOverlap="1">
           <wp:simplePos x="0" y="0"/>
           <wp:positionH relativeFrom="margin">
-            <wp:posOffset>4903942</wp:posOffset>
+            <wp:posOffset>4915535</wp:posOffset>
           </wp:positionH>
           <wp:positionV relativeFrom="margin">
             <wp:posOffset>-715645</wp:posOffset>
           </wp:positionV>
-          <wp:extent cx="1520190" cy="523875"/>
-          <wp:effectExtent l="0" t="0" r="3810" b="9525"/>
+          <wp:extent cx="1569720" cy="551815"/>
+          <wp:effectExtent l="0" t="0" r="0" b="635"/>
           <wp:wrapSquare wrapText="bothSides"/>
-          <wp:docPr id="34" name="Picture 34"/>
+          <wp:docPr id="33" name="Picture 33"/>
           <wp:cNvGraphicFramePr>
             <a:graphicFrameLocks xmlns:a="http://schemas.openxmlformats.org/drawingml/2006/main" noChangeAspect="1"/>
           </wp:cNvGraphicFramePr>
@@ -7109,7 +7109,7 @@
             <a:graphicData uri="http://schemas.openxmlformats.org/drawingml/2006/picture">
               <pic:pic xmlns:pic="http://schemas.openxmlformats.org/drawingml/2006/picture">
                 <pic:nvPicPr>
-                  <pic:cNvPr id="34" name="Screenshot 2026-10-04 100301.png"/>
+                  <pic:cNvPr id="33" name="Screenshot 2026-10-04 100301.png"/>
                   <pic:cNvPicPr/>
                 </pic:nvPicPr>
                 <pic:blipFill>
@@ -7127,7 +7127,7 @@
                 <pic:spPr>
                   <a:xfrm>
                     <a:off x="0" y="0"/>
-                    <a:ext cx="1520190" cy="523875"/>
+                    <a:ext cx="1569720" cy="551815"/>
                   </a:xfrm>
                   <a:prstGeom prst="rect">
                     <a:avLst/>
@@ -7150,7 +7150,7 @@
         <w:noProof/>
       </w:rPr>
       <w:drawing>
-        <wp:anchor distT="0" distB="0" distL="114300" distR="114300" simplePos="0" relativeHeight="251658240" behindDoc="0" locked="0" layoutInCell="1" allowOverlap="1" wp14:anchorId="3D30B1B2" wp14:editId="101DDCA6">
+        <wp:anchor distT="0" distB="0" distL="114300" distR="114300" simplePos="0" relativeHeight="251658240" behindDoc="0" locked="0" layoutInCell="1" allowOverlap="1" wp14:anchorId="6F316EB3" wp14:editId="5670C123">
           <wp:simplePos x="0" y="0"/>
           <wp:positionH relativeFrom="margin">
             <wp:posOffset>-409575</wp:posOffset>

</xml_diff>